<commit_message>
Include current PhD research in resumes
</commit_message>
<xml_diff>
--- a/ats/ATS_AI_Cybersecurity_Research_Resume.docx
+++ b/ats/ATS_AI_Cybersecurity_Research_Resume.docx
@@ -172,7 +172,7 @@
         <w:ind w:left="461" w:hanging="230"/>
       </w:pPr>
       <w:r>
-        <w:t>Build applied neuroengineering systems for BCI and brain-care research, including EEG/fNIRS acquisition, embedded device control, firmware, and Python analysis workflows.</w:t>
+        <w:t>Build current PhD neuroengineering research stack for EEG/fNIRS acquisition, CGX/XDF dataset creation, live BCI classifier/game control, embedded device control, and FPGA temporal QiSNN acceleration.</w:t>
       </w:r>
     </w:p>
     <w:p>
@@ -192,7 +192,7 @@
         <w:ind w:left="461" w:hanging="230"/>
       </w:pPr>
       <w:r>
-        <w:t>Created Sheeg research software that orchestrates CGX EEG, behavioural games, UDP-to-LSL event markers, LabRecorder control, XDF output, manifests, stream probes, and session summaries.</w:t>
+        <w:t>Built CGX/Sheeg workflows that launch CGX Acquisition and LabRecorder, record labelled visual-stimulus XDF sessions, preprocess EEG into CSV datasets, and export model artifacts for live classification.</w:t>
       </w:r>
     </w:p>
     <w:p>
@@ -202,7 +202,7 @@
         <w:ind w:left="461" w:hanging="230"/>
       </w:pPr>
       <w:r>
-        <w:t>Built FPGA research pipelines for ANN, SNN, QSNN/QiSNN, QLIF, PC-DDM-SNN, and rodent-raster decision experiments using Vitis HLS, Vivado, MicroBlaze, BRAM windows, and UART diagnostics.</w:t>
+        <w:t>Developed closed-loop BCI/FPGA and rodent-decision pipelines using ADS1299 frames, MicroBlaze, BRAM windows, temporal QiSNN/SNN accelerators, UDP/UART intent packets, and five-state game control.</w:t>
       </w:r>
     </w:p>
     <w:p>

</xml_diff>

<commit_message>
Add published thesis citation to resumes
</commit_message>
<xml_diff>
--- a/ats/ATS_AI_Cybersecurity_Research_Resume.docx
+++ b/ats/ATS_AI_Cybersecurity_Research_Resume.docx
@@ -495,6 +495,16 @@
     </w:p>
     <w:p>
       <w:pPr>
+        <w:pStyle w:val="ListBullet"/>
+        <w:spacing w:after="40" w:line="250" w:lineRule="auto"/>
+        <w:ind w:left="461" w:hanging="230"/>
+      </w:pPr>
+      <w:r>
+        <w:t>Published thesis: Singh H. A robust intrusion detection system utilizing uncertain reasoning techniques in artificial intelligence. The University of Regina (Canada); 2024.</w:t>
+      </w:r>
+    </w:p>
+    <w:p>
+      <w:pPr>
         <w:pStyle w:val="Heading2"/>
       </w:pPr>
       <w:r>

</xml_diff>